<commit_message>
Reasignar a Alejandro las tareas de Analytics y de coordinación con el desarrollador
Co-Authored-By: Claude Opus 5.5 <noreply@anthropic.com>
Claude-Session: https://claude.ai/code/session_01QP63dGoTMwV6GPYuPDekez
</commit_message>
<xml_diff>
--- a/tareas/1-Tareas-Desarrollador.docx
+++ b/tareas/1-Tareas-Desarrollador.docx
@@ -142,7 +142,7 @@
           <w:sz w:val="22"/>
           <w:szCs w:val="22"/>
         </w:rPr>
-        <w:t xml:space="preserve">Cambios técnicos del plan de trabajo de robotines.com. La responsable de SEO entrega las listas (URL, redirecciones, reglas) y valida cada tarea al terminar. Las tareas 1 y 2 son urgentes: de ellas depende saber si hay una pérdida real de posiciones y medir las ventas.</w:t>
+        <w:t xml:space="preserve">Cambios técnicos del plan de trabajo de robotines.com. Alejandro coordina todas estas tareas: entrega las listas que prepara el equipo de SEO, resuelve dudas y valida cada tarea al terminar. Las tareas 1 y 2 son urgentes: de ellas depende saber si hay una pérdida real de posiciones y medir las ventas.</w:t>
       </w:r>
     </w:p>
     <w:p>
@@ -2227,7 +2227,7 @@
           <w:sz w:val="22"/>
           <w:szCs w:val="22"/>
         </w:rPr>
-        <w:t xml:space="preserve">Listado de cambios entregado a SEO y categoría Gundam verificada.</w:t>
+        <w:t xml:space="preserve">Listado de cambios entregado a Alejandro y categoría Gundam verificada.</w:t>
       </w:r>
     </w:p>
     <w:p>
@@ -2250,7 +2250,7 @@
           <w:sz w:val="22"/>
           <w:szCs w:val="22"/>
         </w:rPr>
-        <w:t xml:space="preserve">Diagnóstico de SEO (tarea 1).</w:t>
+        <w:t xml:space="preserve">Coordina Alejandro (tarea 2).</w:t>
       </w:r>
     </w:p>
     <w:p>
@@ -2395,7 +2395,7 @@
           <w:sz w:val="22"/>
           <w:szCs w:val="22"/>
         </w:rPr>
-        <w:t xml:space="preserve">Hacer un pedido de prueba con SEO y verlo en GA4 › Tiempo real.</w:t>
+        <w:t xml:space="preserve">Hacer un pedido de prueba con Alejandro y verlo en GA4 › Tiempo real.</w:t>
       </w:r>
     </w:p>
     <w:p>
@@ -2441,7 +2441,7 @@
           <w:sz w:val="22"/>
           <w:szCs w:val="22"/>
         </w:rPr>
-        <w:t xml:space="preserve">Accesos que consigue Alejandro (tarea 2). Validación: SEO (tarea 2).</w:t>
+        <w:t xml:space="preserve">Coordina y valida Alejandro (tarea 3).</w:t>
       </w:r>
     </w:p>
     <w:p>
@@ -2532,7 +2532,7 @@
           <w:sz w:val="22"/>
           <w:szCs w:val="22"/>
         </w:rPr>
-        <w:t xml:space="preserve">Recibir de SEO la tabla «URL antigua → URL nueva».</w:t>
+        <w:t xml:space="preserve">Recibir de Alejandro la tabla «URL antigua → URL nueva».</w:t>
       </w:r>
     </w:p>
     <w:p>
@@ -2614,7 +2614,7 @@
           <w:sz w:val="22"/>
           <w:szCs w:val="22"/>
         </w:rPr>
-        <w:t xml:space="preserve">Tabla de SEO (tarea 4).</w:t>
+        <w:t xml:space="preserve">Tabla de SEO entregada por Alejandro (tarea 6).</w:t>
       </w:r>
     </w:p>
     <w:p>
@@ -2759,7 +2759,7 @@
           <w:sz w:val="22"/>
           <w:szCs w:val="22"/>
         </w:rPr>
-        <w:t xml:space="preserve">Avisar a SEO para solicitar la retirada en Search Console.</w:t>
+        <w:t xml:space="preserve">Avisar a Alejandro al terminar (después se solicita la retirada en Search Console).</w:t>
       </w:r>
     </w:p>
     <w:p>
@@ -2805,7 +2805,7 @@
           <w:sz w:val="22"/>
           <w:szCs w:val="22"/>
         </w:rPr>
-        <w:t xml:space="preserve">Retirada en Search Console: SEO (tarea 8).</w:t>
+        <w:t xml:space="preserve">Coordina Alejandro (tarea 6).</w:t>
       </w:r>
     </w:p>
     <w:p>
@@ -2937,6 +2937,24 @@
     </w:p>
     <w:p>
       <w:pPr>
+        <w:pStyle w:val="ListParagraph"/>
+        <w:numPr>
+          <w:ilvl w:val="0"/>
+          <w:numId w:val="6"/>
+        </w:numPr>
+        <w:spacing w:after="40"/>
+      </w:pPr>
+      <w:r>
+        <w:rPr>
+          <w:rFonts w:ascii="Calibri" w:cs="Calibri" w:eastAsia="Calibri" w:hAnsi="Calibri"/>
+          <w:sz w:val="22"/>
+          <w:szCs w:val="22"/>
+        </w:rPr>
+        <w:t xml:space="preserve">Avisar a Alejandro al terminar.</w:t>
+      </w:r>
+    </w:p>
+    <w:p>
+      <w:pPr>
         <w:spacing w:after="80" w:before="60"/>
       </w:pPr>
       <w:r>
@@ -2978,7 +2996,7 @@
           <w:sz w:val="22"/>
           <w:szCs w:val="22"/>
         </w:rPr>
-        <w:t xml:space="preserve">Envío en Search Console: SEO (tarea 8).</w:t>
+        <w:t xml:space="preserve">Coordina Alejandro (tarea 6).</w:t>
       </w:r>
     </w:p>
     <w:p>
@@ -3087,7 +3105,7 @@
           <w:sz w:val="22"/>
           <w:szCs w:val="22"/>
         </w:rPr>
-        <w:t xml:space="preserve">Con la lista de SEO, cambiar en menú, pie y módulos los enlaces a URL redirigidas por la URL final.</w:t>
+        <w:t xml:space="preserve">Con la lista que entrega Alejandro, cambiar en menú, pie y módulos los enlaces a URL redirigidas por la URL final.</w:t>
       </w:r>
     </w:p>
     <w:p>
@@ -3133,7 +3151,7 @@
           <w:sz w:val="22"/>
           <w:szCs w:val="22"/>
         </w:rPr>
-        <w:t xml:space="preserve">Lista de SEO (tarea 4).</w:t>
+        <w:t xml:space="preserve">Lista de SEO entregada por Alejandro (tarea 6).</w:t>
       </w:r>
     </w:p>
     <w:p>
@@ -3324,7 +3342,7 @@
           <w:sz w:val="22"/>
           <w:szCs w:val="22"/>
         </w:rPr>
-        <w:t xml:space="preserve">Datos de envío del cliente vía Alejandro (tarea 1).</w:t>
+        <w:t xml:space="preserve">Datos de envío del cliente y validación: Alejandro (tareas 1, 6 y 8).</w:t>
       </w:r>
     </w:p>
     <w:p>
@@ -3510,7 +3528,7 @@
           <w:sz w:val="22"/>
           <w:szCs w:val="22"/>
         </w:rPr>
-        <w:t xml:space="preserve">Comprobado por SEO en una página de cada tipo.</w:t>
+        <w:t xml:space="preserve">Comprobado por Alejandro en una página de cada tipo.</w:t>
       </w:r>
     </w:p>
     <w:p>
@@ -3533,7 +3551,7 @@
           <w:sz w:val="22"/>
           <w:szCs w:val="22"/>
         </w:rPr>
-        <w:t xml:space="preserve">Decisión sobre el francés: Alejandro.</w:t>
+        <w:t xml:space="preserve">Decisión sobre el francés y validación: Alejandro (tareas 1 y 8).</w:t>
       </w:r>
     </w:p>
     <w:p>
@@ -3624,7 +3642,7 @@
           <w:sz w:val="22"/>
           <w:szCs w:val="22"/>
         </w:rPr>
-        <w:t xml:space="preserve">Esperar a que SEO registre las mediciones de partida.</w:t>
+        <w:t xml:space="preserve">Recibir de Alejandro las mediciones de partida.</w:t>
       </w:r>
     </w:p>
     <w:p>
@@ -3678,7 +3696,7 @@
           <w:sz w:val="22"/>
           <w:szCs w:val="22"/>
         </w:rPr>
-        <w:t xml:space="preserve">Avisar a SEO tras cada cambio para medir de nuevo.</w:t>
+        <w:t xml:space="preserve">Avisar a Alejandro tras cada cambio para medir de nuevo.</w:t>
       </w:r>
     </w:p>
     <w:p>
@@ -3724,7 +3742,7 @@
           <w:sz w:val="22"/>
           <w:szCs w:val="22"/>
         </w:rPr>
-        <w:t xml:space="preserve">Medición de SEO (tarea 11).</w:t>
+        <w:t xml:space="preserve">Coordina Alejandro (tarea 10).</w:t>
       </w:r>
     </w:p>
     <w:p>
@@ -3815,7 +3833,7 @@
           <w:sz w:val="22"/>
           <w:szCs w:val="22"/>
         </w:rPr>
-        <w:t xml:space="preserve">Recibir la estructura de menú aprobada por el cliente.</w:t>
+        <w:t xml:space="preserve">Recibir de Alejandro la estructura de menú aprobada por el cliente.</w:t>
       </w:r>
     </w:p>
     <w:p>
@@ -3897,7 +3915,7 @@
           <w:sz w:val="22"/>
           <w:szCs w:val="22"/>
         </w:rPr>
-        <w:t xml:space="preserve">Aprobación del cliente vía Alejandro (tarea 4).</w:t>
+        <w:t xml:space="preserve">Aprobación del cliente vía Alejandro (tarea 9).</w:t>
       </w:r>
     </w:p>
     <w:p>
@@ -4052,7 +4070,7 @@
           <w:sz w:val="22"/>
           <w:szCs w:val="22"/>
         </w:rPr>
-        <w:t xml:space="preserve">Si no se alcanza: decisión de Alejandro sobre el tema (tarea 8).</w:t>
+        <w:t xml:space="preserve">Coordina Alejandro (tareas 10 y 14).</w:t>
       </w:r>
     </w:p>
     <w:p>
@@ -4143,7 +4161,7 @@
           <w:sz w:val="22"/>
           <w:szCs w:val="22"/>
         </w:rPr>
-        <w:t xml:space="preserve">Aplicar noindex a las combinaciones de filtros que indique SEO y sacarlas del sitemap.</w:t>
+        <w:t xml:space="preserve">Aplicar noindex a las combinaciones de filtros que indique Alejandro y sacarlas del sitemap.</w:t>
       </w:r>
     </w:p>
     <w:p>
@@ -4202,7 +4220,7 @@
           <w:sz w:val="22"/>
           <w:szCs w:val="22"/>
         </w:rPr>
-        <w:t xml:space="preserve">Reglas aplicadas y validadas por SEO.</w:t>
+        <w:t xml:space="preserve">Reglas aplicadas y validadas por Alejandro.</w:t>
       </w:r>
     </w:p>
     <w:p>
@@ -4225,7 +4243,7 @@
           <w:sz w:val="22"/>
           <w:szCs w:val="22"/>
         </w:rPr>
-        <w:t xml:space="preserve">Reglas de SEO (tarea 13).</w:t>
+        <w:t xml:space="preserve">Reglas de SEO entregadas por Alejandro (tarea 12).</w:t>
       </w:r>
     </w:p>
     <w:p>

</xml_diff>

<commit_message>
Dejar a la responsable de SEO solo el SEO on page; lo técnico pasa a Alejandro
Co-Authored-By: Claude Opus 5.5 <noreply@anthropic.com>
Claude-Session: https://claude.ai/code/session_01QP63dGoTMwV6GPYuPDekez
</commit_message>
<xml_diff>
--- a/tareas/1-Tareas-Desarrollador.docx
+++ b/tareas/1-Tareas-Desarrollador.docx
@@ -142,7 +142,7 @@
           <w:sz w:val="22"/>
           <w:szCs w:val="22"/>
         </w:rPr>
-        <w:t xml:space="preserve">Cambios técnicos del plan de trabajo de robotines.com. Alejandro coordina todas estas tareas: entrega las listas que prepara el equipo de SEO, resuelve dudas y valida cada tarea al terminar. Las tareas 1 y 2 son urgentes: de ellas depende saber si hay una pérdida real de posiciones y medir las ventas.</w:t>
+        <w:t xml:space="preserve">Cambios técnicos del plan de trabajo de robotines.com. Alejandro coordina todas estas tareas: entrega las listas técnicas, resuelve dudas y valida cada tarea al terminar. Las tareas 1 y 2 son urgentes: de ellas depende saber si hay una pérdida real de posiciones y medir las ventas.</w:t>
       </w:r>
     </w:p>
     <w:p>
@@ -2614,7 +2614,7 @@
           <w:sz w:val="22"/>
           <w:szCs w:val="22"/>
         </w:rPr>
-        <w:t xml:space="preserve">Tabla de SEO entregada por Alejandro (tarea 6).</w:t>
+        <w:t xml:space="preserve">Tabla de Alejandro (tarea 6).</w:t>
       </w:r>
     </w:p>
     <w:p>
@@ -3151,7 +3151,7 @@
           <w:sz w:val="22"/>
           <w:szCs w:val="22"/>
         </w:rPr>
-        <w:t xml:space="preserve">Lista de SEO entregada por Alejandro (tarea 6).</w:t>
+        <w:t xml:space="preserve">Lista de Alejandro (tarea 6).</w:t>
       </w:r>
     </w:p>
     <w:p>
@@ -3742,7 +3742,7 @@
           <w:sz w:val="22"/>
           <w:szCs w:val="22"/>
         </w:rPr>
-        <w:t xml:space="preserve">Coordina Alejandro (tarea 10).</w:t>
+        <w:t xml:space="preserve">Coordina Alejandro (tarea 9).</w:t>
       </w:r>
     </w:p>
     <w:p>
@@ -3915,7 +3915,7 @@
           <w:sz w:val="22"/>
           <w:szCs w:val="22"/>
         </w:rPr>
-        <w:t xml:space="preserve">Aprobación del cliente vía Alejandro (tarea 9).</w:t>
+        <w:t xml:space="preserve">Aprobación del cliente vía Alejandro (tarea 10).</w:t>
       </w:r>
     </w:p>
     <w:p>
@@ -4070,7 +4070,7 @@
           <w:sz w:val="22"/>
           <w:szCs w:val="22"/>
         </w:rPr>
-        <w:t xml:space="preserve">Coordina Alejandro (tareas 10 y 14).</w:t>
+        <w:t xml:space="preserve">Coordina Alejandro (tareas 9 y 14).</w:t>
       </w:r>
     </w:p>
     <w:p>
@@ -4243,7 +4243,7 @@
           <w:sz w:val="22"/>
           <w:szCs w:val="22"/>
         </w:rPr>
-        <w:t xml:space="preserve">Reglas de SEO entregadas por Alejandro (tarea 12).</w:t>
+        <w:t xml:space="preserve">Reglas de Alejandro (tarea 12).</w:t>
       </w:r>
     </w:p>
     <w:p>

</xml_diff>